<commit_message>
update : ajout tous les fichiers 3 sites projet
</commit_message>
<xml_diff>
--- a/MoonWebsite/annexe/CdC.docx
+++ b/MoonWebsite/annexe/CdC.docx
@@ -146,9 +146,6 @@
     <w:p>
       <w:pPr>
         <w:pStyle w:val="TM1"/>
-        <w:tabs>
-          <w:tab w:val="right" w:leader="dot" w:pos="9060"/>
-        </w:tabs>
         <w:rPr>
           <w:rFonts w:eastAsiaTheme="minorEastAsia" w:cstheme="minorBidi"/>
           <w:noProof/>
@@ -535,9 +532,6 @@
     <w:p>
       <w:pPr>
         <w:pStyle w:val="TM1"/>
-        <w:tabs>
-          <w:tab w:val="right" w:leader="dot" w:pos="9060"/>
-        </w:tabs>
         <w:rPr>
           <w:rFonts w:eastAsiaTheme="minorEastAsia" w:cstheme="minorBidi"/>
           <w:noProof/>
@@ -754,9 +748,6 @@
     <w:p>
       <w:pPr>
         <w:pStyle w:val="TM1"/>
-        <w:tabs>
-          <w:tab w:val="right" w:leader="dot" w:pos="9060"/>
-        </w:tabs>
         <w:rPr>
           <w:rFonts w:eastAsiaTheme="minorEastAsia" w:cstheme="minorBidi"/>
           <w:noProof/>
@@ -827,9 +818,6 @@
     <w:p>
       <w:pPr>
         <w:pStyle w:val="TM1"/>
-        <w:tabs>
-          <w:tab w:val="right" w:leader="dot" w:pos="9060"/>
-        </w:tabs>
         <w:rPr>
           <w:rFonts w:eastAsiaTheme="minorEastAsia" w:cstheme="minorBidi"/>
           <w:noProof/>
@@ -900,9 +888,6 @@
     <w:p>
       <w:pPr>
         <w:pStyle w:val="TM1"/>
-        <w:tabs>
-          <w:tab w:val="right" w:leader="dot" w:pos="9060"/>
-        </w:tabs>
         <w:rPr>
           <w:rFonts w:eastAsiaTheme="minorEastAsia" w:cstheme="minorBidi"/>
           <w:noProof/>
@@ -1265,9 +1250,6 @@
     <w:p>
       <w:pPr>
         <w:pStyle w:val="TM1"/>
-        <w:tabs>
-          <w:tab w:val="right" w:leader="dot" w:pos="9060"/>
-        </w:tabs>
         <w:rPr>
           <w:rFonts w:eastAsiaTheme="minorEastAsia" w:cstheme="minorBidi"/>
           <w:noProof/>
@@ -1338,9 +1320,6 @@
     <w:p>
       <w:pPr>
         <w:pStyle w:val="TM1"/>
-        <w:tabs>
-          <w:tab w:val="right" w:leader="dot" w:pos="9060"/>
-        </w:tabs>
         <w:rPr>
           <w:rFonts w:eastAsiaTheme="minorEastAsia" w:cstheme="minorBidi"/>
           <w:noProof/>
@@ -1411,9 +1390,6 @@
     <w:p>
       <w:pPr>
         <w:pStyle w:val="TM1"/>
-        <w:tabs>
-          <w:tab w:val="right" w:leader="dot" w:pos="9060"/>
-        </w:tabs>
         <w:rPr>
           <w:rFonts w:eastAsiaTheme="minorEastAsia" w:cstheme="minorBidi"/>
           <w:noProof/>
@@ -1484,9 +1460,6 @@
     <w:p>
       <w:pPr>
         <w:pStyle w:val="TM1"/>
-        <w:tabs>
-          <w:tab w:val="right" w:leader="dot" w:pos="9060"/>
-        </w:tabs>
         <w:rPr>
           <w:rFonts w:eastAsiaTheme="minorEastAsia" w:cstheme="minorBidi"/>
           <w:noProof/>
@@ -5212,9 +5185,6 @@
           <w:p>
             <w:pPr>
               <w:pStyle w:val="TM1"/>
-              <w:tabs>
-                <w:tab w:val="right" w:leader="dot" w:pos="9060"/>
-              </w:tabs>
               <w:rPr>
                 <w:rFonts w:eastAsiaTheme="minorEastAsia" w:cstheme="minorBidi"/>
                 <w:noProof/>
@@ -5545,9 +5515,6 @@
           <w:p>
             <w:pPr>
               <w:pStyle w:val="TM1"/>
-              <w:tabs>
-                <w:tab w:val="right" w:leader="dot" w:pos="9060"/>
-              </w:tabs>
             </w:pPr>
             <w:r>
               <w:t>Nettoyer/Structurer mon code HTML/CSS pour que ça soit + propre et mon repo GitHub qui était une poubelle…</w:t>
@@ -5633,9 +5600,6 @@
           <w:p>
             <w:pPr>
               <w:pStyle w:val="TM1"/>
-              <w:tabs>
-                <w:tab w:val="right" w:leader="dot" w:pos="9060"/>
-              </w:tabs>
             </w:pPr>
             <w:r>
               <w:t>Chercher un nouveau projet à faire</w:t>
@@ -5647,9 +5611,6 @@
           <w:p>
             <w:pPr>
               <w:pStyle w:val="TM1"/>
-              <w:tabs>
-                <w:tab w:val="right" w:leader="dot" w:pos="9060"/>
-              </w:tabs>
             </w:pPr>
             <w:r>
               <w:t xml:space="preserve">Faire un nouveau projet : </w:t>
@@ -5671,8 +5632,16 @@
                 <w:rPr>
                   <w:rStyle w:val="Lienhypertexte"/>
                 </w:rPr>
-                <w:t>://github.com/Agashae/AstroLab</w:t>
+                <w:t>://github.com/Agashae/</w:t>
               </w:r>
+              <w:proofErr w:type="spellStart"/>
+              <w:r>
+                <w:rPr>
+                  <w:rStyle w:val="Lienhypertexte"/>
+                </w:rPr>
+                <w:t>AstroLab</w:t>
+              </w:r>
+              <w:proofErr w:type="spellEnd"/>
             </w:hyperlink>
           </w:p>
         </w:tc>
@@ -5764,12 +5733,17 @@
           <w:p>
             <w:pPr>
               <w:pStyle w:val="TM1"/>
-              <w:tabs>
-                <w:tab w:val="right" w:leader="dot" w:pos="9060"/>
-              </w:tabs>
             </w:pPr>
             <w:r>
-              <w:t>Découvrir la synthaxe de Python grâce à des docs et des vidéos</w:t>
+              <w:t xml:space="preserve">Découvrir la </w:t>
+            </w:r>
+            <w:proofErr w:type="spellStart"/>
+            <w:r>
+              <w:t>synthaxe</w:t>
+            </w:r>
+            <w:proofErr w:type="spellEnd"/>
+            <w:r>
+              <w:t xml:space="preserve"> de Python grâce à des docs et des vidéos</w:t>
             </w:r>
           </w:p>
         </w:tc>
@@ -5858,12 +5832,17 @@
           <w:p>
             <w:pPr>
               <w:pStyle w:val="TM1"/>
-              <w:tabs>
-                <w:tab w:val="right" w:leader="dot" w:pos="9060"/>
-              </w:tabs>
             </w:pPr>
             <w:r>
-              <w:t>Créer la première def avec des conditions/boucles de choix</w:t>
+              <w:t xml:space="preserve">Créer la première </w:t>
+            </w:r>
+            <w:proofErr w:type="spellStart"/>
+            <w:r>
+              <w:t>def</w:t>
+            </w:r>
+            <w:proofErr w:type="spellEnd"/>
+            <w:r>
+              <w:t xml:space="preserve"> avec des conditions/boucles de choix</w:t>
             </w:r>
           </w:p>
         </w:tc>
@@ -5955,12 +5934,17 @@
           <w:p>
             <w:pPr>
               <w:pStyle w:val="TM1"/>
-              <w:tabs>
-                <w:tab w:val="right" w:leader="dot" w:pos="9060"/>
-              </w:tabs>
             </w:pPr>
             <w:r>
-              <w:t>Créer la def planètes() : pour avoir un dictionnaire de data</w:t>
+              <w:t xml:space="preserve">Créer la </w:t>
+            </w:r>
+            <w:proofErr w:type="spellStart"/>
+            <w:r>
+              <w:t>def</w:t>
+            </w:r>
+            <w:proofErr w:type="spellEnd"/>
+            <w:r>
+              <w:t xml:space="preserve"> planètes() : pour avoir un dictionnaire de data</w:t>
             </w:r>
           </w:p>
         </w:tc>
@@ -6052,12 +6036,25 @@
           <w:p>
             <w:pPr>
               <w:pStyle w:val="TM1"/>
-              <w:tabs>
-                <w:tab w:val="right" w:leader="dot" w:pos="9060"/>
-              </w:tabs>
             </w:pPr>
             <w:r>
-              <w:t>Check si la valeur de user peut être prise dans le tableau et apprendre return</w:t>
+              <w:t xml:space="preserve">Check si la valeur </w:t>
+            </w:r>
+            <w:proofErr w:type="gramStart"/>
+            <w:r>
+              <w:t>de user</w:t>
+            </w:r>
+            <w:proofErr w:type="gramEnd"/>
+            <w:r>
+              <w:t xml:space="preserve"> </w:t>
+            </w:r>
+            <w:proofErr w:type="gramStart"/>
+            <w:r>
+              <w:t>peut être</w:t>
+            </w:r>
+            <w:proofErr w:type="gramEnd"/>
+            <w:r>
+              <w:t xml:space="preserve"> prise dans le tableau et apprendre return</w:t>
             </w:r>
           </w:p>
         </w:tc>
@@ -6146,9 +6143,6 @@
           <w:p>
             <w:pPr>
               <w:pStyle w:val="TM1"/>
-              <w:tabs>
-                <w:tab w:val="right" w:leader="dot" w:pos="9060"/>
-              </w:tabs>
             </w:pPr>
             <w:r>
               <w:t>Rendre mon code beau dans le terminal</w:t>
@@ -6240,12 +6234,25 @@
           <w:p>
             <w:pPr>
               <w:pStyle w:val="TM1"/>
-              <w:tabs>
-                <w:tab w:val="right" w:leader="dot" w:pos="9060"/>
-              </w:tabs>
             </w:pPr>
             <w:r>
-              <w:t xml:space="preserve">Créer la def fusees avec un calcul, avec des fusées, calculer le carburant </w:t>
+              <w:t xml:space="preserve">Créer la </w:t>
+            </w:r>
+            <w:proofErr w:type="spellStart"/>
+            <w:r>
+              <w:t>def</w:t>
+            </w:r>
+            <w:proofErr w:type="spellEnd"/>
+            <w:r>
+              <w:t xml:space="preserve"> </w:t>
+            </w:r>
+            <w:proofErr w:type="spellStart"/>
+            <w:r>
+              <w:t>fusees</w:t>
+            </w:r>
+            <w:proofErr w:type="spellEnd"/>
+            <w:r>
+              <w:t xml:space="preserve"> avec un calcul, avec des fusées, calculer le carburant </w:t>
             </w:r>
             <w:r>
               <w:lastRenderedPageBreak/>
@@ -6353,12 +6360,25 @@
           <w:p>
             <w:pPr>
               <w:pStyle w:val="TM1"/>
-              <w:tabs>
-                <w:tab w:val="right" w:leader="dot" w:pos="9060"/>
-              </w:tabs>
             </w:pPr>
             <w:r>
-              <w:t xml:space="preserve">Créer la def calculs qui va calculer le poids sur une planete + galérer à récupérer toutes les données des autres tableaux + hauteur saut + temps de voyage + âge cosmique </w:t>
+              <w:t xml:space="preserve">Créer la </w:t>
+            </w:r>
+            <w:proofErr w:type="spellStart"/>
+            <w:r>
+              <w:t>def</w:t>
+            </w:r>
+            <w:proofErr w:type="spellEnd"/>
+            <w:r>
+              <w:t xml:space="preserve"> calculs qui va calculer le poids sur une </w:t>
+            </w:r>
+            <w:proofErr w:type="spellStart"/>
+            <w:r>
+              <w:t>planete</w:t>
+            </w:r>
+            <w:proofErr w:type="spellEnd"/>
+            <w:r>
+              <w:t xml:space="preserve"> + galérer à récupérer toutes les données des autres tableaux + hauteur saut + temps de voyage + âge cosmique </w:t>
             </w:r>
           </w:p>
         </w:tc>
@@ -6444,9 +6464,6 @@
           <w:p>
             <w:pPr>
               <w:pStyle w:val="TM1"/>
-              <w:tabs>
-                <w:tab w:val="right" w:leader="dot" w:pos="9060"/>
-              </w:tabs>
             </w:pPr>
             <w:r>
               <w:t>Création d’un PowerPoint pour la présentation de mercredi prochain + ajout de mes projets Portes Ouvertes + 2 projets DemoMot</w:t>
@@ -6535,9 +6552,6 @@
           <w:p>
             <w:pPr>
               <w:pStyle w:val="TM1"/>
-              <w:tabs>
-                <w:tab w:val="right" w:leader="dot" w:pos="9060"/>
-              </w:tabs>
             </w:pPr>
             <w:r>
               <w:t>Régler problème de création PWA sur mobile depuis que j’ai activé un CNAME et restructurer mon repo</w:t>
@@ -6596,10 +6610,101 @@
           </w:tcPr>
           <w:p>
             <w:r>
+              <w:t>23</w:t>
+            </w:r>
+            <w:r>
+              <w:t>.06.26</w:t>
+            </w:r>
+          </w:p>
+        </w:tc>
+      </w:tr>
+      <w:tr>
+        <w:tc>
+          <w:tcPr>
+            <w:tcW w:w="3562" w:type="dxa"/>
+            <w:gridSpan w:val="2"/>
+            <w:tcBorders>
+              <w:top w:val="single" w:sz="1" w:space="0" w:color="CCCCCC"/>
+              <w:left w:val="single" w:sz="1" w:space="0" w:color="CCCCCC"/>
+              <w:bottom w:val="single" w:sz="1" w:space="0" w:color="CCCCCC"/>
+              <w:right w:val="single" w:sz="1" w:space="0" w:color="CCCCCC"/>
+            </w:tcBorders>
+            <w:shd w:val="clear" w:color="auto" w:fill="FFFFFF" w:themeFill="background1"/>
+            <w:tcMar>
+              <w:top w:w="80" w:type="dxa"/>
+              <w:left w:w="120" w:type="dxa"/>
+              <w:bottom w:w="80" w:type="dxa"/>
+              <w:right w:w="120" w:type="dxa"/>
+            </w:tcMar>
+          </w:tcPr>
+          <w:p>
+            <w:pPr>
+              <w:pStyle w:val="TM1"/>
+            </w:pPr>
+            <w:r>
+              <w:t>Ajout nouvelles images (</w:t>
+            </w:r>
+            <w:r>
+              <w:t>Rencontre Célestes</w:t>
+            </w:r>
+            <w:r>
+              <w:t>)</w:t>
+            </w:r>
+          </w:p>
+        </w:tc>
+        <w:tc>
+          <w:tcPr>
+            <w:tcW w:w="1101" w:type="dxa"/>
+            <w:gridSpan w:val="2"/>
+            <w:tcBorders>
+              <w:top w:val="single" w:sz="1" w:space="0" w:color="CCCCCC"/>
+              <w:left w:val="single" w:sz="1" w:space="0" w:color="CCCCCC"/>
+              <w:bottom w:val="single" w:sz="1" w:space="0" w:color="CCCCCC"/>
+              <w:right w:val="single" w:sz="1" w:space="0" w:color="CCCCCC"/>
+            </w:tcBorders>
+            <w:shd w:val="clear" w:color="auto" w:fill="FFFFFF" w:themeFill="background1"/>
+            <w:tcMar>
+              <w:top w:w="80" w:type="dxa"/>
+              <w:left w:w="120" w:type="dxa"/>
+              <w:bottom w:w="80" w:type="dxa"/>
+              <w:right w:w="120" w:type="dxa"/>
+            </w:tcMar>
+          </w:tcPr>
+          <w:p>
+            <w:r>
+              <w:t xml:space="preserve">1 séquence de </w:t>
+            </w:r>
+            <w:r>
               <w:t>2</w:t>
             </w:r>
             <w:r>
-              <w:t>3</w:t>
+              <w:t xml:space="preserve"> période</w:t>
+            </w:r>
+            <w:r>
+              <w:t>s</w:t>
+            </w:r>
+          </w:p>
+        </w:tc>
+        <w:tc>
+          <w:tcPr>
+            <w:tcW w:w="1009" w:type="dxa"/>
+            <w:tcBorders>
+              <w:top w:val="single" w:sz="1" w:space="0" w:color="CCCCCC"/>
+              <w:left w:val="single" w:sz="1" w:space="0" w:color="CCCCCC"/>
+              <w:bottom w:val="single" w:sz="1" w:space="0" w:color="CCCCCC"/>
+              <w:right w:val="single" w:sz="1" w:space="0" w:color="CCCCCC"/>
+            </w:tcBorders>
+            <w:shd w:val="clear" w:color="auto" w:fill="FFFFFF" w:themeFill="background1"/>
+            <w:tcMar>
+              <w:top w:w="80" w:type="dxa"/>
+              <w:left w:w="120" w:type="dxa"/>
+              <w:bottom w:w="80" w:type="dxa"/>
+              <w:right w:w="120" w:type="dxa"/>
+            </w:tcMar>
+          </w:tcPr>
+          <w:p>
+            <w:r>
+              <w:t>23</w:t>
             </w:r>
             <w:r>
               <w:t>.06.26</w:t>
@@ -6813,7 +6918,6 @@
       </w:pPr>
       <w:bookmarkStart w:id="18" w:name="_Toc232678051"/>
       <w:r>
-        <w:lastRenderedPageBreak/>
         <w:t>Observations &amp; Analyse</w:t>
       </w:r>
       <w:bookmarkEnd w:id="18"/>
@@ -7616,7 +7720,7 @@
               <w:noProof/>
               <w:szCs w:val="16"/>
             </w:rPr>
-            <w:t>22.06.2026 08:14</w:t>
+            <w:t>22.06.2026 08:39</w:t>
           </w:r>
           <w:r>
             <w:rPr>
@@ -10180,7 +10284,6 @@
   <w:style w:type="character" w:default="1" w:styleId="Policepardfaut">
     <w:name w:val="Default Paragraph Font"/>
     <w:uiPriority w:val="1"/>
-    <w:semiHidden/>
     <w:unhideWhenUsed/>
   </w:style>
   <w:style w:type="table" w:default="1" w:styleId="TableauNormal">
@@ -10499,8 +10602,11 @@
     <w:autoRedefine/>
     <w:uiPriority w:val="39"/>
     <w:unhideWhenUsed/>
-    <w:rsid w:val="009B57E9"/>
+    <w:rsid w:val="00FE0F42"/>
     <w:pPr>
+      <w:tabs>
+        <w:tab w:val="right" w:leader="dot" w:pos="9060"/>
+      </w:tabs>
       <w:spacing w:after="100"/>
     </w:pPr>
   </w:style>

</xml_diff>